<commit_message>
Add login endpoint logic
</commit_message>
<xml_diff>
--- a/Диплом_ПЗ_Ганчевський_Олександр_ІПЗ_22_2_.docx
+++ b/Диплом_ПЗ_Ганчевський_Олександр_ІПЗ_22_2_.docx
@@ -197,7 +197,6 @@
           <w:color w:val="000000"/>
           <w:sz w:val="40"/>
           <w:szCs w:val="40"/>
-          <w:lang w:val="uk-UA"/>
         </w:rPr>
       </w:pPr>
       <w:r>
@@ -208,18 +207,7 @@
           <w:sz w:val="40"/>
           <w:szCs w:val="40"/>
         </w:rPr>
-        <w:t>КУРСОВ</w:t>
-      </w:r>
-      <w:r>
-        <w:rPr>
-          <w:b/>
-          <w:bCs/>
-          <w:color w:val="000000"/>
-          <w:sz w:val="40"/>
-          <w:szCs w:val="40"/>
-          <w:lang w:val="uk-UA"/>
-        </w:rPr>
-        <w:t>А РОБОТА</w:t>
+        <w:t>ДИПЛОМНА РОБОТА</w:t>
       </w:r>
     </w:p>
     <w:p>
@@ -413,49 +401,144 @@
         </w:rPr>
         <w:t>«</w:t>
       </w:r>
-      <w:r>
-        <w:rPr>
+      <w:proofErr w:type="spellStart"/>
+      <w:r>
+        <w:rPr>
+          <w:bCs/>
           <w:color w:val="000000"/>
           <w:sz w:val="28"/>
           <w:szCs w:val="28"/>
         </w:rPr>
-        <w:t>Веб-</w:t>
-      </w:r>
-      <w:proofErr w:type="spellStart"/>
-      <w:r>
-        <w:rPr>
+        <w:t>Вебзастосунок</w:t>
+      </w:r>
+      <w:proofErr w:type="spellEnd"/>
+      <w:r>
+        <w:rPr>
+          <w:bCs/>
           <w:color w:val="000000"/>
           <w:sz w:val="28"/>
           <w:szCs w:val="28"/>
         </w:rPr>
-        <w:t>додаток</w:t>
-      </w:r>
-      <w:proofErr w:type="spellEnd"/>
-      <w:r>
-        <w:rPr>
+        <w:t xml:space="preserve"> для </w:t>
+      </w:r>
+      <w:proofErr w:type="spellStart"/>
+      <w:r>
+        <w:rPr>
+          <w:bCs/>
           <w:color w:val="000000"/>
           <w:sz w:val="28"/>
           <w:szCs w:val="28"/>
         </w:rPr>
-        <w:t xml:space="preserve"> для </w:t>
-      </w:r>
-      <w:proofErr w:type="spellStart"/>
-      <w:r>
-        <w:rPr>
+        <w:t>прогнозування</w:t>
+      </w:r>
+      <w:proofErr w:type="spellEnd"/>
+      <w:r>
+        <w:rPr>
+          <w:bCs/>
           <w:color w:val="000000"/>
           <w:sz w:val="28"/>
           <w:szCs w:val="28"/>
         </w:rPr>
-        <w:t>оренди</w:t>
-      </w:r>
-      <w:proofErr w:type="spellEnd"/>
-      <w:r>
-        <w:rPr>
+        <w:t xml:space="preserve"> </w:t>
+      </w:r>
+      <w:proofErr w:type="spellStart"/>
+      <w:r>
+        <w:rPr>
+          <w:bCs/>
           <w:color w:val="000000"/>
           <w:sz w:val="28"/>
           <w:szCs w:val="28"/>
         </w:rPr>
-        <w:t xml:space="preserve"> транспорту»</w:t>
+        <w:t>ринкових</w:t>
+      </w:r>
+      <w:proofErr w:type="spellEnd"/>
+      <w:r>
+        <w:rPr>
+          <w:bCs/>
+          <w:color w:val="000000"/>
+          <w:sz w:val="28"/>
+          <w:szCs w:val="28"/>
+        </w:rPr>
+        <w:t xml:space="preserve"> </w:t>
+      </w:r>
+      <w:proofErr w:type="spellStart"/>
+      <w:r>
+        <w:rPr>
+          <w:bCs/>
+          <w:color w:val="000000"/>
+          <w:sz w:val="28"/>
+          <w:szCs w:val="28"/>
+        </w:rPr>
+        <w:t>трендів</w:t>
+      </w:r>
+      <w:proofErr w:type="spellEnd"/>
+      <w:r>
+        <w:rPr>
+          <w:bCs/>
+          <w:color w:val="000000"/>
+          <w:sz w:val="28"/>
+          <w:szCs w:val="28"/>
+        </w:rPr>
+        <w:t xml:space="preserve"> на </w:t>
+      </w:r>
+      <w:proofErr w:type="spellStart"/>
+      <w:r>
+        <w:rPr>
+          <w:bCs/>
+          <w:color w:val="000000"/>
+          <w:sz w:val="28"/>
+          <w:szCs w:val="28"/>
+        </w:rPr>
+        <w:t>основі</w:t>
+      </w:r>
+      <w:proofErr w:type="spellEnd"/>
+      <w:r>
+        <w:rPr>
+          <w:bCs/>
+          <w:color w:val="000000"/>
+          <w:sz w:val="28"/>
+          <w:szCs w:val="28"/>
+        </w:rPr>
+        <w:t xml:space="preserve"> </w:t>
+      </w:r>
+      <w:proofErr w:type="spellStart"/>
+      <w:r>
+        <w:rPr>
+          <w:bCs/>
+          <w:color w:val="000000"/>
+          <w:sz w:val="28"/>
+          <w:szCs w:val="28"/>
+        </w:rPr>
+        <w:t>ансамблів</w:t>
+      </w:r>
+      <w:proofErr w:type="spellEnd"/>
+      <w:r>
+        <w:rPr>
+          <w:bCs/>
+          <w:color w:val="000000"/>
+          <w:sz w:val="28"/>
+          <w:szCs w:val="28"/>
+        </w:rPr>
+        <w:t xml:space="preserve"> </w:t>
+      </w:r>
+      <w:proofErr w:type="spellStart"/>
+      <w:r>
+        <w:rPr>
+          <w:bCs/>
+          <w:color w:val="000000"/>
+          <w:sz w:val="28"/>
+          <w:szCs w:val="28"/>
+        </w:rPr>
+        <w:t>нейромереж</w:t>
+      </w:r>
+      <w:proofErr w:type="spellEnd"/>
+      <w:r>
+        <w:rPr>
+          <w:color w:val="000000"/>
+          <w:sz w:val="28"/>
+          <w:szCs w:val="28"/>
+        </w:rPr>
+        <w:t>»</w:t>
       </w:r>
     </w:p>
     <w:p>
@@ -3132,7 +3215,7 @@
         </w:p>
         <w:p>
           <w:pPr>
-            <w:pStyle w:val="21"/>
+            <w:pStyle w:val="11"/>
             <w:tabs>
               <w:tab w:val="right" w:leader="dot" w:pos="9745"/>
             </w:tabs>
@@ -3165,79 +3248,7 @@
             </w:rPr>
             <w:fldChar w:fldCharType="separate"/>
           </w:r>
-          <w:hyperlink w:anchor="_Toc224673623" w:history="1">
-            <w:r>
-              <w:rPr>
-                <w:rStyle w:val="a8"/>
-                <w:noProof/>
-              </w:rPr>
-              <w:t>ВСТУП</w:t>
-            </w:r>
-            <w:r>
-              <w:rPr>
-                <w:noProof/>
-                <w:webHidden/>
-              </w:rPr>
-              <w:tab/>
-            </w:r>
-            <w:r>
-              <w:rPr>
-                <w:noProof/>
-                <w:webHidden/>
-              </w:rPr>
-              <w:fldChar w:fldCharType="begin"/>
-            </w:r>
-            <w:r>
-              <w:rPr>
-                <w:noProof/>
-                <w:webHidden/>
-              </w:rPr>
-              <w:instrText xml:space="preserve"> PAGEREF _Toc224673623 \h </w:instrText>
-            </w:r>
-            <w:r>
-              <w:rPr>
-                <w:noProof/>
-                <w:webHidden/>
-              </w:rPr>
-            </w:r>
-            <w:r>
-              <w:rPr>
-                <w:noProof/>
-                <w:webHidden/>
-              </w:rPr>
-              <w:fldChar w:fldCharType="separate"/>
-            </w:r>
-            <w:r>
-              <w:rPr>
-                <w:noProof/>
-                <w:webHidden/>
-              </w:rPr>
-              <w:t>6</w:t>
-            </w:r>
-            <w:r>
-              <w:rPr>
-                <w:noProof/>
-                <w:webHidden/>
-              </w:rPr>
-              <w:fldChar w:fldCharType="end"/>
-            </w:r>
-          </w:hyperlink>
-        </w:p>
-        <w:p>
-          <w:pPr>
-            <w:pStyle w:val="11"/>
-            <w:tabs>
-              <w:tab w:val="right" w:leader="dot" w:pos="9745"/>
-            </w:tabs>
-            <w:rPr>
-              <w:rFonts w:asciiTheme="minorHAnsi" w:eastAsiaTheme="minorEastAsia" w:hAnsiTheme="minorHAnsi" w:cstheme="minorBidi"/>
-              <w:noProof/>
-              <w:sz w:val="22"/>
-              <w:szCs w:val="22"/>
-              <w:lang w:val="uk-UA" w:eastAsia="uk-UA"/>
-            </w:rPr>
-          </w:pPr>
-          <w:hyperlink w:anchor="_Toc224673624" w:history="1">
+          <w:hyperlink w:anchor="_Toc228266816" w:history="1">
             <w:r>
               <w:rPr>
                 <w:rStyle w:val="a8"/>
@@ -3264,7 +3275,7 @@
                 <w:noProof/>
                 <w:webHidden/>
               </w:rPr>
-              <w:instrText xml:space="preserve"> PAGEREF _Toc224673624 \h </w:instrText>
+              <w:instrText xml:space="preserve"> PAGEREF _Toc228266816 \h </w:instrText>
             </w:r>
             <w:r>
               <w:rPr>
@@ -3284,426 +3295,7 @@
                 <w:noProof/>
                 <w:webHidden/>
               </w:rPr>
-              <w:t>8</w:t>
-            </w:r>
-            <w:r>
-              <w:rPr>
-                <w:noProof/>
-                <w:webHidden/>
-              </w:rPr>
-              <w:fldChar w:fldCharType="end"/>
-            </w:r>
-          </w:hyperlink>
-        </w:p>
-        <w:p>
-          <w:pPr>
-            <w:pStyle w:val="21"/>
-            <w:tabs>
-              <w:tab w:val="left" w:pos="880"/>
-              <w:tab w:val="right" w:leader="dot" w:pos="9745"/>
-            </w:tabs>
-            <w:rPr>
-              <w:rFonts w:asciiTheme="minorHAnsi" w:eastAsiaTheme="minorEastAsia" w:hAnsiTheme="minorHAnsi" w:cstheme="minorBidi"/>
-              <w:noProof/>
-              <w:sz w:val="22"/>
-              <w:szCs w:val="22"/>
-              <w:lang w:val="uk-UA" w:eastAsia="uk-UA"/>
-            </w:rPr>
-          </w:pPr>
-          <w:hyperlink w:anchor="_Toc224673625" w:history="1">
-            <w:r>
-              <w:rPr>
-                <w:rStyle w:val="a8"/>
-                <w:noProof/>
-                <w:lang w:val="uk-UA"/>
-              </w:rPr>
-              <w:t>1.1.</w:t>
-            </w:r>
-            <w:r>
-              <w:rPr>
-                <w:rFonts w:asciiTheme="minorHAnsi" w:eastAsiaTheme="minorEastAsia" w:hAnsiTheme="minorHAnsi" w:cstheme="minorBidi"/>
-                <w:noProof/>
-                <w:sz w:val="22"/>
-                <w:szCs w:val="22"/>
-                <w:lang w:val="uk-UA" w:eastAsia="uk-UA"/>
-              </w:rPr>
-              <w:tab/>
-            </w:r>
-            <w:r>
-              <w:rPr>
-                <w:rStyle w:val="a8"/>
-                <w:noProof/>
-                <w:lang w:val="uk-UA"/>
-              </w:rPr>
-              <w:t>Опис предметної області та обґрунтування актуальності теми</w:t>
-            </w:r>
-            <w:r>
-              <w:rPr>
-                <w:noProof/>
-                <w:webHidden/>
-              </w:rPr>
-              <w:tab/>
-            </w:r>
-            <w:r>
-              <w:rPr>
-                <w:noProof/>
-                <w:webHidden/>
-              </w:rPr>
-              <w:fldChar w:fldCharType="begin"/>
-            </w:r>
-            <w:r>
-              <w:rPr>
-                <w:noProof/>
-                <w:webHidden/>
-              </w:rPr>
-              <w:instrText xml:space="preserve"> PAGEREF _Toc224673625 \h </w:instrText>
-            </w:r>
-            <w:r>
-              <w:rPr>
-                <w:noProof/>
-                <w:webHidden/>
-              </w:rPr>
-            </w:r>
-            <w:r>
-              <w:rPr>
-                <w:noProof/>
-                <w:webHidden/>
-              </w:rPr>
-              <w:fldChar w:fldCharType="separate"/>
-            </w:r>
-            <w:r>
-              <w:rPr>
-                <w:noProof/>
-                <w:webHidden/>
-              </w:rPr>
-              <w:t>8</w:t>
-            </w:r>
-            <w:r>
-              <w:rPr>
-                <w:noProof/>
-                <w:webHidden/>
-              </w:rPr>
-              <w:fldChar w:fldCharType="end"/>
-            </w:r>
-          </w:hyperlink>
-        </w:p>
-        <w:p>
-          <w:pPr>
-            <w:pStyle w:val="21"/>
-            <w:tabs>
-              <w:tab w:val="left" w:pos="880"/>
-              <w:tab w:val="right" w:leader="dot" w:pos="9745"/>
-            </w:tabs>
-            <w:rPr>
-              <w:rFonts w:asciiTheme="minorHAnsi" w:eastAsiaTheme="minorEastAsia" w:hAnsiTheme="minorHAnsi" w:cstheme="minorBidi"/>
-              <w:noProof/>
-              <w:sz w:val="22"/>
-              <w:szCs w:val="22"/>
-              <w:lang w:val="uk-UA" w:eastAsia="uk-UA"/>
-            </w:rPr>
-          </w:pPr>
-          <w:hyperlink w:anchor="_Toc224673626" w:history="1">
-            <w:r>
-              <w:rPr>
-                <w:rStyle w:val="a8"/>
-                <w:noProof/>
-              </w:rPr>
-              <w:t>1.2.</w:t>
-            </w:r>
-            <w:r>
-              <w:rPr>
-                <w:rFonts w:asciiTheme="minorHAnsi" w:eastAsiaTheme="minorEastAsia" w:hAnsiTheme="minorHAnsi" w:cstheme="minorBidi"/>
-                <w:noProof/>
-                <w:sz w:val="22"/>
-                <w:szCs w:val="22"/>
-                <w:lang w:val="uk-UA" w:eastAsia="uk-UA"/>
-              </w:rPr>
-              <w:tab/>
-            </w:r>
-            <w:r>
-              <w:rPr>
-                <w:rStyle w:val="a8"/>
-                <w:noProof/>
-              </w:rPr>
-              <w:t>Аналіз  існуючих рішень (аналогів)</w:t>
-            </w:r>
-            <w:r>
-              <w:rPr>
-                <w:noProof/>
-                <w:webHidden/>
-              </w:rPr>
-              <w:tab/>
-            </w:r>
-            <w:r>
-              <w:rPr>
-                <w:noProof/>
-                <w:webHidden/>
-              </w:rPr>
-              <w:fldChar w:fldCharType="begin"/>
-            </w:r>
-            <w:r>
-              <w:rPr>
-                <w:noProof/>
-                <w:webHidden/>
-              </w:rPr>
-              <w:instrText xml:space="preserve"> PAGEREF _Toc224673626 \h </w:instrText>
-            </w:r>
-            <w:r>
-              <w:rPr>
-                <w:noProof/>
-                <w:webHidden/>
-              </w:rPr>
-            </w:r>
-            <w:r>
-              <w:rPr>
-                <w:noProof/>
-                <w:webHidden/>
-              </w:rPr>
-              <w:fldChar w:fldCharType="separate"/>
-            </w:r>
-            <w:r>
-              <w:rPr>
-                <w:noProof/>
-                <w:webHidden/>
-              </w:rPr>
-              <w:t>8</w:t>
-            </w:r>
-            <w:r>
-              <w:rPr>
-                <w:noProof/>
-                <w:webHidden/>
-              </w:rPr>
-              <w:fldChar w:fldCharType="end"/>
-            </w:r>
-          </w:hyperlink>
-        </w:p>
-        <w:p>
-          <w:pPr>
-            <w:pStyle w:val="21"/>
-            <w:tabs>
-              <w:tab w:val="left" w:pos="880"/>
-              <w:tab w:val="right" w:leader="dot" w:pos="9745"/>
-            </w:tabs>
-            <w:rPr>
-              <w:rFonts w:asciiTheme="minorHAnsi" w:eastAsiaTheme="minorEastAsia" w:hAnsiTheme="minorHAnsi" w:cstheme="minorBidi"/>
-              <w:noProof/>
-              <w:sz w:val="22"/>
-              <w:szCs w:val="22"/>
-              <w:lang w:val="uk-UA" w:eastAsia="uk-UA"/>
-            </w:rPr>
-          </w:pPr>
-          <w:hyperlink w:anchor="_Toc224673627" w:history="1">
-            <w:r>
-              <w:rPr>
-                <w:rStyle w:val="a8"/>
-                <w:noProof/>
-                <w:lang w:val="uk-UA"/>
-              </w:rPr>
-              <w:t>1.3.</w:t>
-            </w:r>
-            <w:r>
-              <w:rPr>
-                <w:rFonts w:asciiTheme="minorHAnsi" w:eastAsiaTheme="minorEastAsia" w:hAnsiTheme="minorHAnsi" w:cstheme="minorBidi"/>
-                <w:noProof/>
-                <w:sz w:val="22"/>
-                <w:szCs w:val="22"/>
-                <w:lang w:val="uk-UA" w:eastAsia="uk-UA"/>
-              </w:rPr>
-              <w:tab/>
-            </w:r>
-            <w:r>
-              <w:rPr>
-                <w:rStyle w:val="a8"/>
-                <w:noProof/>
-                <w:lang w:val="uk-UA"/>
-              </w:rPr>
-              <w:t>Постановка задачі та формування вимог до системи</w:t>
-            </w:r>
-            <w:r>
-              <w:rPr>
-                <w:noProof/>
-                <w:webHidden/>
-              </w:rPr>
-              <w:tab/>
-            </w:r>
-            <w:r>
-              <w:rPr>
-                <w:noProof/>
-                <w:webHidden/>
-              </w:rPr>
-              <w:fldChar w:fldCharType="begin"/>
-            </w:r>
-            <w:r>
-              <w:rPr>
-                <w:noProof/>
-                <w:webHidden/>
-              </w:rPr>
-              <w:instrText xml:space="preserve"> PAGEREF _Toc224673627 \h </w:instrText>
-            </w:r>
-            <w:r>
-              <w:rPr>
-                <w:noProof/>
-                <w:webHidden/>
-              </w:rPr>
-            </w:r>
-            <w:r>
-              <w:rPr>
-                <w:noProof/>
-                <w:webHidden/>
-              </w:rPr>
-              <w:fldChar w:fldCharType="separate"/>
-            </w:r>
-            <w:r>
-              <w:rPr>
-                <w:noProof/>
-                <w:webHidden/>
-              </w:rPr>
-              <w:t>9</w:t>
-            </w:r>
-            <w:r>
-              <w:rPr>
-                <w:noProof/>
-                <w:webHidden/>
-              </w:rPr>
-              <w:fldChar w:fldCharType="end"/>
-            </w:r>
-          </w:hyperlink>
-        </w:p>
-        <w:p>
-          <w:pPr>
-            <w:pStyle w:val="31"/>
-            <w:tabs>
-              <w:tab w:val="right" w:leader="dot" w:pos="9745"/>
-            </w:tabs>
-            <w:rPr>
-              <w:rFonts w:asciiTheme="minorHAnsi" w:eastAsiaTheme="minorEastAsia" w:hAnsiTheme="minorHAnsi" w:cstheme="minorBidi"/>
-              <w:noProof/>
-              <w:sz w:val="22"/>
-              <w:szCs w:val="22"/>
-              <w:lang w:val="uk-UA" w:eastAsia="uk-UA"/>
-            </w:rPr>
-          </w:pPr>
-          <w:hyperlink w:anchor="_Toc224673628" w:history="1">
-            <w:r>
-              <w:rPr>
-                <w:rStyle w:val="a8"/>
-                <w:noProof/>
-                <w:lang w:val="uk-UA"/>
-              </w:rPr>
-              <w:t>1.3.1. Функціональні вимоги</w:t>
-            </w:r>
-            <w:r>
-              <w:rPr>
-                <w:noProof/>
-                <w:webHidden/>
-              </w:rPr>
-              <w:tab/>
-            </w:r>
-            <w:r>
-              <w:rPr>
-                <w:noProof/>
-                <w:webHidden/>
-              </w:rPr>
-              <w:fldChar w:fldCharType="begin"/>
-            </w:r>
-            <w:r>
-              <w:rPr>
-                <w:noProof/>
-                <w:webHidden/>
-              </w:rPr>
-              <w:instrText xml:space="preserve"> PAGEREF _Toc224673628 \h </w:instrText>
-            </w:r>
-            <w:r>
-              <w:rPr>
-                <w:noProof/>
-                <w:webHidden/>
-              </w:rPr>
-            </w:r>
-            <w:r>
-              <w:rPr>
-                <w:noProof/>
-                <w:webHidden/>
-              </w:rPr>
-              <w:fldChar w:fldCharType="separate"/>
-            </w:r>
-            <w:r>
-              <w:rPr>
-                <w:noProof/>
-                <w:webHidden/>
-              </w:rPr>
-              <w:t>9</w:t>
-            </w:r>
-            <w:r>
-              <w:rPr>
-                <w:noProof/>
-                <w:webHidden/>
-              </w:rPr>
-              <w:fldChar w:fldCharType="end"/>
-            </w:r>
-          </w:hyperlink>
-        </w:p>
-        <w:p>
-          <w:pPr>
-            <w:pStyle w:val="31"/>
-            <w:tabs>
-              <w:tab w:val="right" w:leader="dot" w:pos="9745"/>
-            </w:tabs>
-            <w:rPr>
-              <w:rFonts w:asciiTheme="minorHAnsi" w:eastAsiaTheme="minorEastAsia" w:hAnsiTheme="minorHAnsi" w:cstheme="minorBidi"/>
-              <w:noProof/>
-              <w:sz w:val="22"/>
-              <w:szCs w:val="22"/>
-              <w:lang w:val="uk-UA" w:eastAsia="uk-UA"/>
-            </w:rPr>
-          </w:pPr>
-          <w:hyperlink w:anchor="_Toc224673629" w:history="1">
-            <w:r>
-              <w:rPr>
-                <w:rStyle w:val="a8"/>
-                <w:noProof/>
-              </w:rPr>
-              <w:t>1.3.2. Нефункціональні вимоги</w:t>
-            </w:r>
-            <w:r>
-              <w:rPr>
-                <w:noProof/>
-                <w:webHidden/>
-              </w:rPr>
-              <w:tab/>
-            </w:r>
-            <w:r>
-              <w:rPr>
-                <w:noProof/>
-                <w:webHidden/>
-              </w:rPr>
-              <w:fldChar w:fldCharType="begin"/>
-            </w:r>
-            <w:r>
-              <w:rPr>
-                <w:noProof/>
-                <w:webHidden/>
-              </w:rPr>
-              <w:instrText xml:space="preserve"> PAGEREF _Toc224673629 \h </w:instrText>
-            </w:r>
-            <w:r>
-              <w:rPr>
-                <w:noProof/>
-                <w:webHidden/>
-              </w:rPr>
-            </w:r>
-            <w:r>
-              <w:rPr>
-                <w:noProof/>
-                <w:webHidden/>
-              </w:rPr>
-              <w:fldChar w:fldCharType="separate"/>
-            </w:r>
-            <w:r>
-              <w:rPr>
-                <w:noProof/>
-                <w:webHidden/>
-              </w:rPr>
-              <w:t>9</w:t>
+              <w:t>7</w:t>
             </w:r>
             <w:r>
               <w:rPr>
@@ -3728,14 +3320,21 @@
               <w:lang w:val="uk-UA" w:eastAsia="uk-UA"/>
             </w:rPr>
           </w:pPr>
-          <w:hyperlink w:anchor="_Toc224673630" w:history="1">
+          <w:hyperlink w:anchor="_Toc228266817" w:history="1">
             <w:r>
               <w:rPr>
                 <w:rStyle w:val="a8"/>
                 <w:noProof/>
                 <w:lang w:val="uk-UA"/>
               </w:rPr>
-              <w:t>Висновки до першного розділу</w:t>
+              <w:t>1.</w:t>
+            </w:r>
+            <w:r>
+              <w:rPr>
+                <w:rStyle w:val="a8"/>
+                <w:noProof/>
+              </w:rPr>
+              <w:t>1. Постановлення завдань, та їх вирішення</w:t>
             </w:r>
             <w:r>
               <w:rPr>
@@ -3756,7 +3355,79 @@
                 <w:noProof/>
                 <w:webHidden/>
               </w:rPr>
-              <w:instrText xml:space="preserve"> PAGEREF _Toc224673630 \h </w:instrText>
+              <w:instrText xml:space="preserve"> PAGEREF _Toc228266817 \h </w:instrText>
+            </w:r>
+            <w:r>
+              <w:rPr>
+                <w:noProof/>
+                <w:webHidden/>
+              </w:rPr>
+            </w:r>
+            <w:r>
+              <w:rPr>
+                <w:noProof/>
+                <w:webHidden/>
+              </w:rPr>
+              <w:fldChar w:fldCharType="separate"/>
+            </w:r>
+            <w:r>
+              <w:rPr>
+                <w:noProof/>
+                <w:webHidden/>
+              </w:rPr>
+              <w:t>7</w:t>
+            </w:r>
+            <w:r>
+              <w:rPr>
+                <w:noProof/>
+                <w:webHidden/>
+              </w:rPr>
+              <w:fldChar w:fldCharType="end"/>
+            </w:r>
+          </w:hyperlink>
+        </w:p>
+        <w:p>
+          <w:pPr>
+            <w:pStyle w:val="21"/>
+            <w:tabs>
+              <w:tab w:val="right" w:leader="dot" w:pos="9745"/>
+            </w:tabs>
+            <w:rPr>
+              <w:rFonts w:asciiTheme="minorHAnsi" w:eastAsiaTheme="minorEastAsia" w:hAnsiTheme="minorHAnsi" w:cstheme="minorBidi"/>
+              <w:noProof/>
+              <w:sz w:val="22"/>
+              <w:szCs w:val="22"/>
+              <w:lang w:val="uk-UA" w:eastAsia="uk-UA"/>
+            </w:rPr>
+          </w:pPr>
+          <w:hyperlink w:anchor="_Toc228266818" w:history="1">
+            <w:r>
+              <w:rPr>
+                <w:rStyle w:val="a8"/>
+                <w:noProof/>
+              </w:rPr>
+              <w:t>1.2. Аналіз схожого програмного забезпечення</w:t>
+            </w:r>
+            <w:r>
+              <w:rPr>
+                <w:noProof/>
+                <w:webHidden/>
+              </w:rPr>
+              <w:tab/>
+            </w:r>
+            <w:r>
+              <w:rPr>
+                <w:noProof/>
+                <w:webHidden/>
+              </w:rPr>
+              <w:fldChar w:fldCharType="begin"/>
+            </w:r>
+            <w:r>
+              <w:rPr>
+                <w:noProof/>
+                <w:webHidden/>
+              </w:rPr>
+              <w:instrText xml:space="preserve"> PAGEREF _Toc228266818 \h </w:instrText>
             </w:r>
             <w:r>
               <w:rPr>
@@ -3789,7 +3460,7 @@
         </w:p>
         <w:p>
           <w:pPr>
-            <w:pStyle w:val="11"/>
+            <w:pStyle w:val="21"/>
             <w:tabs>
               <w:tab w:val="right" w:leader="dot" w:pos="9745"/>
             </w:tabs>
@@ -3801,21 +3472,13 @@
               <w:lang w:val="uk-UA" w:eastAsia="uk-UA"/>
             </w:rPr>
           </w:pPr>
-          <w:hyperlink w:anchor="_Toc224673631" w:history="1">
+          <w:hyperlink w:anchor="_Toc228266819" w:history="1">
             <w:r>
               <w:rPr>
                 <w:rStyle w:val="a8"/>
                 <w:noProof/>
               </w:rPr>
-              <w:t>РОЗДІЛ 2. ПРО</w:t>
-            </w:r>
-            <w:r>
-              <w:rPr>
-                <w:rStyle w:val="a8"/>
-                <w:noProof/>
-                <w:lang w:val="uk-UA"/>
-              </w:rPr>
-              <w:t>ЄКТУВАННЯ ТА РЕАЛІЗАЦІЯ ПРОГРАМНОГО ЗАСТОСУНКУ</w:t>
+              <w:t>1.3. Визначення архітектури програмного забезпечення</w:t>
             </w:r>
             <w:r>
               <w:rPr>
@@ -3836,7 +3499,7 @@
                 <w:noProof/>
                 <w:webHidden/>
               </w:rPr>
-              <w:instrText xml:space="preserve"> PAGEREF _Toc224673631 \h </w:instrText>
+              <w:instrText xml:space="preserve"> PAGEREF _Toc228266819 \h </w:instrText>
             </w:r>
             <w:r>
               <w:rPr>
@@ -3856,7 +3519,7 @@
                 <w:noProof/>
                 <w:webHidden/>
               </w:rPr>
-              <w:t>11</w:t>
+              <w:t>15</w:t>
             </w:r>
             <w:r>
               <w:rPr>
@@ -3869,9 +3532,8 @@
         </w:p>
         <w:p>
           <w:pPr>
-            <w:pStyle w:val="31"/>
+            <w:pStyle w:val="21"/>
             <w:tabs>
-              <w:tab w:val="left" w:pos="1100"/>
               <w:tab w:val="right" w:leader="dot" w:pos="9745"/>
             </w:tabs>
             <w:rPr>
@@ -3882,32 +3544,13 @@
               <w:lang w:val="uk-UA" w:eastAsia="uk-UA"/>
             </w:rPr>
           </w:pPr>
-          <w:hyperlink w:anchor="_Toc224673632" w:history="1">
+          <w:hyperlink w:anchor="_Toc228266820" w:history="1">
             <w:r>
               <w:rPr>
                 <w:rStyle w:val="a8"/>
                 <w:noProof/>
-                <w:lang w:val="uk-UA"/>
               </w:rPr>
-              <w:t>2.1.</w:t>
-            </w:r>
-            <w:r>
-              <w:rPr>
-                <w:rFonts w:asciiTheme="minorHAnsi" w:eastAsiaTheme="minorEastAsia" w:hAnsiTheme="minorHAnsi" w:cstheme="minorBidi"/>
-                <w:noProof/>
-                <w:sz w:val="22"/>
-                <w:szCs w:val="22"/>
-                <w:lang w:val="uk-UA" w:eastAsia="uk-UA"/>
-              </w:rPr>
-              <w:tab/>
-            </w:r>
-            <w:r>
-              <w:rPr>
-                <w:rStyle w:val="a8"/>
-                <w:noProof/>
-                <w:lang w:val="uk-UA"/>
-              </w:rPr>
-              <w:t>Вибір архітектури та технологічного стеку</w:t>
+              <w:t>1.4. Обґрунтування вибору інструментальних засобів та вимоги до програмного забезпечення</w:t>
             </w:r>
             <w:r>
               <w:rPr>
@@ -3928,187 +3571,7 @@
                 <w:noProof/>
                 <w:webHidden/>
               </w:rPr>
-              <w:instrText xml:space="preserve"> PAGEREF _Toc224673632 \h </w:instrText>
-            </w:r>
-            <w:r>
-              <w:rPr>
-                <w:noProof/>
-                <w:webHidden/>
-              </w:rPr>
-            </w:r>
-            <w:r>
-              <w:rPr>
-                <w:noProof/>
-                <w:webHidden/>
-              </w:rPr>
-              <w:fldChar w:fldCharType="separate"/>
-            </w:r>
-            <w:r>
-              <w:rPr>
-                <w:noProof/>
-                <w:webHidden/>
-              </w:rPr>
-              <w:t>11</w:t>
-            </w:r>
-            <w:r>
-              <w:rPr>
-                <w:noProof/>
-                <w:webHidden/>
-              </w:rPr>
-              <w:fldChar w:fldCharType="end"/>
-            </w:r>
-          </w:hyperlink>
-        </w:p>
-        <w:p>
-          <w:pPr>
-            <w:pStyle w:val="21"/>
-            <w:tabs>
-              <w:tab w:val="left" w:pos="880"/>
-              <w:tab w:val="right" w:leader="dot" w:pos="9745"/>
-            </w:tabs>
-            <w:rPr>
-              <w:rFonts w:asciiTheme="minorHAnsi" w:eastAsiaTheme="minorEastAsia" w:hAnsiTheme="minorHAnsi" w:cstheme="minorBidi"/>
-              <w:noProof/>
-              <w:sz w:val="22"/>
-              <w:szCs w:val="22"/>
-              <w:lang w:val="uk-UA" w:eastAsia="uk-UA"/>
-            </w:rPr>
-          </w:pPr>
-          <w:hyperlink w:anchor="_Toc224673633" w:history="1">
-            <w:r>
-              <w:rPr>
-                <w:rStyle w:val="a8"/>
-                <w:noProof/>
-              </w:rPr>
-              <w:t>2.2.</w:t>
-            </w:r>
-            <w:r>
-              <w:rPr>
-                <w:rFonts w:asciiTheme="minorHAnsi" w:eastAsiaTheme="minorEastAsia" w:hAnsiTheme="minorHAnsi" w:cstheme="minorBidi"/>
-                <w:noProof/>
-                <w:sz w:val="22"/>
-                <w:szCs w:val="22"/>
-                <w:lang w:val="uk-UA" w:eastAsia="uk-UA"/>
-              </w:rPr>
-              <w:tab/>
-            </w:r>
-            <w:r>
-              <w:rPr>
-                <w:rStyle w:val="a8"/>
-                <w:noProof/>
-              </w:rPr>
-              <w:t>Проєктування бази даних та доменної моделі</w:t>
-            </w:r>
-            <w:r>
-              <w:rPr>
-                <w:noProof/>
-                <w:webHidden/>
-              </w:rPr>
-              <w:tab/>
-            </w:r>
-            <w:r>
-              <w:rPr>
-                <w:noProof/>
-                <w:webHidden/>
-              </w:rPr>
-              <w:fldChar w:fldCharType="begin"/>
-            </w:r>
-            <w:r>
-              <w:rPr>
-                <w:noProof/>
-                <w:webHidden/>
-              </w:rPr>
-              <w:instrText xml:space="preserve"> PAGEREF _Toc224673633 \h </w:instrText>
-            </w:r>
-            <w:r>
-              <w:rPr>
-                <w:noProof/>
-                <w:webHidden/>
-              </w:rPr>
-            </w:r>
-            <w:r>
-              <w:rPr>
-                <w:noProof/>
-                <w:webHidden/>
-              </w:rPr>
-              <w:fldChar w:fldCharType="separate"/>
-            </w:r>
-            <w:r>
-              <w:rPr>
-                <w:noProof/>
-                <w:webHidden/>
-              </w:rPr>
-              <w:t>14</w:t>
-            </w:r>
-            <w:r>
-              <w:rPr>
-                <w:noProof/>
-                <w:webHidden/>
-              </w:rPr>
-              <w:fldChar w:fldCharType="end"/>
-            </w:r>
-          </w:hyperlink>
-        </w:p>
-        <w:p>
-          <w:pPr>
-            <w:pStyle w:val="31"/>
-            <w:tabs>
-              <w:tab w:val="left" w:pos="1100"/>
-              <w:tab w:val="right" w:leader="dot" w:pos="9745"/>
-            </w:tabs>
-            <w:rPr>
-              <w:rFonts w:asciiTheme="minorHAnsi" w:eastAsiaTheme="minorEastAsia" w:hAnsiTheme="minorHAnsi" w:cstheme="minorBidi"/>
-              <w:noProof/>
-              <w:sz w:val="22"/>
-              <w:szCs w:val="22"/>
-              <w:lang w:val="uk-UA" w:eastAsia="uk-UA"/>
-            </w:rPr>
-          </w:pPr>
-          <w:hyperlink w:anchor="_Toc224673634" w:history="1">
-            <w:r>
-              <w:rPr>
-                <w:rStyle w:val="a8"/>
-                <w:noProof/>
-              </w:rPr>
-              <w:t>2.3.</w:t>
-            </w:r>
-            <w:r>
-              <w:rPr>
-                <w:rFonts w:asciiTheme="minorHAnsi" w:eastAsiaTheme="minorEastAsia" w:hAnsiTheme="minorHAnsi" w:cstheme="minorBidi"/>
-                <w:noProof/>
-                <w:sz w:val="22"/>
-                <w:szCs w:val="22"/>
-                <w:lang w:val="uk-UA" w:eastAsia="uk-UA"/>
-              </w:rPr>
-              <w:tab/>
-            </w:r>
-            <w:r>
-              <w:rPr>
-                <w:rStyle w:val="a8"/>
-                <w:noProof/>
-              </w:rPr>
-              <w:t>Реалізація системи безпеки та авторизації</w:t>
-            </w:r>
-            <w:r>
-              <w:rPr>
-                <w:noProof/>
-                <w:webHidden/>
-              </w:rPr>
-              <w:tab/>
-            </w:r>
-            <w:r>
-              <w:rPr>
-                <w:noProof/>
-                <w:webHidden/>
-              </w:rPr>
-              <w:fldChar w:fldCharType="begin"/>
-            </w:r>
-            <w:r>
-              <w:rPr>
-                <w:noProof/>
-                <w:webHidden/>
-              </w:rPr>
-              <w:instrText xml:space="preserve"> PAGEREF _Toc224673634 \h </w:instrText>
+              <w:instrText xml:space="preserve"> PAGEREF _Toc228266820 \h </w:instrText>
             </w:r>
             <w:r>
               <w:rPr>
@@ -4153,13 +3616,13 @@
               <w:lang w:val="uk-UA" w:eastAsia="uk-UA"/>
             </w:rPr>
           </w:pPr>
-          <w:hyperlink w:anchor="_Toc224673635" w:history="1">
+          <w:hyperlink w:anchor="_Toc228266821" w:history="1">
             <w:r>
               <w:rPr>
                 <w:rStyle w:val="a8"/>
                 <w:noProof/>
               </w:rPr>
-              <w:t>Висновки до другого розділу</w:t>
+              <w:t>Висновки до першого розділу</w:t>
             </w:r>
             <w:r>
               <w:rPr>
@@ -4180,7 +3643,7 @@
                 <w:noProof/>
                 <w:webHidden/>
               </w:rPr>
-              <w:instrText xml:space="preserve"> PAGEREF _Toc224673635 \h </w:instrText>
+              <w:instrText xml:space="preserve"> PAGEREF _Toc228266821 \h </w:instrText>
             </w:r>
             <w:r>
               <w:rPr>
@@ -4213,7 +3676,7 @@
         </w:p>
         <w:p>
           <w:pPr>
-            <w:pStyle w:val="21"/>
+            <w:pStyle w:val="11"/>
             <w:tabs>
               <w:tab w:val="right" w:leader="dot" w:pos="9745"/>
             </w:tabs>
@@ -4225,14 +3688,29 @@
               <w:lang w:val="uk-UA" w:eastAsia="uk-UA"/>
             </w:rPr>
           </w:pPr>
-          <w:hyperlink w:anchor="_Toc224673636" w:history="1">
+          <w:hyperlink w:anchor="_Toc228266822" w:history="1">
             <w:r>
               <w:rPr>
                 <w:rStyle w:val="a8"/>
                 <w:noProof/>
                 <w:lang w:val="uk-UA"/>
               </w:rPr>
-              <w:t>РОЗДІЛ 3. РОЗРОБКА ІНТЕРФЕЙСУ ТА КЕРІВНИЦТВО КОРИСТУВАЧА</w:t>
+              <w:t xml:space="preserve">РОЗДІЛ 2. ПРОЄКТУВАННЯ ТА РОЗРОБКА </w:t>
+            </w:r>
+            <w:r>
+              <w:rPr>
+                <w:rStyle w:val="a8"/>
+                <w:noProof/>
+              </w:rPr>
+              <w:t>WEB</w:t>
+            </w:r>
+            <w:r>
+              <w:rPr>
+                <w:rStyle w:val="a8"/>
+                <w:noProof/>
+                <w:lang w:val="uk-UA"/>
+              </w:rPr>
+              <w:t xml:space="preserve"> ДОДАТКУ ДЛЯ ПРОГНОЗУВАННЯ ТРЕНДІВ ЗА ДОПОМГОЮ АНСАМБЛІВ НЕЙРОМЕРЕЖ</w:t>
             </w:r>
             <w:r>
               <w:rPr>
@@ -4253,7 +3731,7 @@
                 <w:noProof/>
                 <w:webHidden/>
               </w:rPr>
-              <w:instrText xml:space="preserve"> PAGEREF _Toc224673636 \h </w:instrText>
+              <w:instrText xml:space="preserve"> PAGEREF _Toc228266822 \h </w:instrText>
             </w:r>
             <w:r>
               <w:rPr>
@@ -4298,14 +3776,14 @@
               <w:lang w:val="uk-UA" w:eastAsia="uk-UA"/>
             </w:rPr>
           </w:pPr>
-          <w:hyperlink w:anchor="_Toc224673637" w:history="1">
+          <w:hyperlink w:anchor="_Toc228266823" w:history="1">
             <w:r>
               <w:rPr>
                 <w:rStyle w:val="a8"/>
                 <w:noProof/>
                 <w:lang w:val="uk-UA"/>
               </w:rPr>
-              <w:t>3.1. Опис користувацького інтерфейсу та кілєнтської частини веб-додатка</w:t>
+              <w:t>2.1 Проектування бази даних</w:t>
             </w:r>
             <w:r>
               <w:rPr>
@@ -4326,7 +3804,7 @@
                 <w:noProof/>
                 <w:webHidden/>
               </w:rPr>
-              <w:instrText xml:space="preserve"> PAGEREF _Toc224673637 \h </w:instrText>
+              <w:instrText xml:space="preserve"> PAGEREF _Toc228266823 \h </w:instrText>
             </w:r>
             <w:r>
               <w:rPr>
@@ -4371,14 +3849,14 @@
               <w:lang w:val="uk-UA" w:eastAsia="uk-UA"/>
             </w:rPr>
           </w:pPr>
-          <w:hyperlink w:anchor="_Toc224673638" w:history="1">
+          <w:hyperlink w:anchor="_Toc228266824" w:history="1">
             <w:r>
               <w:rPr>
                 <w:rStyle w:val="a8"/>
                 <w:noProof/>
                 <w:lang w:val="uk-UA"/>
               </w:rPr>
-              <w:t>3.2. Панель адміністратора та управління</w:t>
+              <w:t>2.2. Розробка архітектури додатку</w:t>
             </w:r>
             <w:r>
               <w:rPr>
@@ -4399,7 +3877,7 @@
                 <w:noProof/>
                 <w:webHidden/>
               </w:rPr>
-              <w:instrText xml:space="preserve"> PAGEREF _Toc224673638 \h </w:instrText>
+              <w:instrText xml:space="preserve"> PAGEREF _Toc228266824 \h </w:instrText>
             </w:r>
             <w:r>
               <w:rPr>
@@ -4444,14 +3922,13 @@
               <w:lang w:val="uk-UA" w:eastAsia="uk-UA"/>
             </w:rPr>
           </w:pPr>
-          <w:hyperlink w:anchor="_Toc224673639" w:history="1">
+          <w:hyperlink w:anchor="_Toc228266825" w:history="1">
             <w:r>
               <w:rPr>
                 <w:rStyle w:val="a8"/>
                 <w:noProof/>
-                <w:lang w:val="uk-UA"/>
               </w:rPr>
-              <w:t>Висновки до третього розділу</w:t>
+              <w:t>2.3. Розробка функціональних методів для роботи програми</w:t>
             </w:r>
             <w:r>
               <w:rPr>
@@ -4472,7 +3949,7 @@
                 <w:noProof/>
                 <w:webHidden/>
               </w:rPr>
-              <w:instrText xml:space="preserve"> PAGEREF _Toc224673639 \h </w:instrText>
+              <w:instrText xml:space="preserve"> PAGEREF _Toc228266825 \h </w:instrText>
             </w:r>
             <w:r>
               <w:rPr>
@@ -4517,21 +3994,14 @@
               <w:lang w:val="uk-UA" w:eastAsia="uk-UA"/>
             </w:rPr>
           </w:pPr>
-          <w:hyperlink w:anchor="_Toc224673640" w:history="1">
+          <w:hyperlink w:anchor="_Toc228266826" w:history="1">
             <w:r>
               <w:rPr>
                 <w:rStyle w:val="a8"/>
                 <w:noProof/>
                 <w:lang w:val="uk-UA"/>
               </w:rPr>
-              <w:t>Сп</w:t>
-            </w:r>
-            <w:r>
-              <w:rPr>
-                <w:rStyle w:val="a8"/>
-                <w:noProof/>
-              </w:rPr>
-              <w:t>исок використаних джерел</w:t>
+              <w:t>2.4. Збереження файлів</w:t>
             </w:r>
             <w:r>
               <w:rPr>
@@ -4552,7 +4022,80 @@
                 <w:noProof/>
                 <w:webHidden/>
               </w:rPr>
-              <w:instrText xml:space="preserve"> PAGEREF _Toc224673640 \h </w:instrText>
+              <w:instrText xml:space="preserve"> PAGEREF _Toc228266826 \h </w:instrText>
+            </w:r>
+            <w:r>
+              <w:rPr>
+                <w:noProof/>
+                <w:webHidden/>
+              </w:rPr>
+            </w:r>
+            <w:r>
+              <w:rPr>
+                <w:noProof/>
+                <w:webHidden/>
+              </w:rPr>
+              <w:fldChar w:fldCharType="separate"/>
+            </w:r>
+            <w:r>
+              <w:rPr>
+                <w:noProof/>
+                <w:webHidden/>
+              </w:rPr>
+              <w:t>27</w:t>
+            </w:r>
+            <w:r>
+              <w:rPr>
+                <w:noProof/>
+                <w:webHidden/>
+              </w:rPr>
+              <w:fldChar w:fldCharType="end"/>
+            </w:r>
+          </w:hyperlink>
+        </w:p>
+        <w:p>
+          <w:pPr>
+            <w:pStyle w:val="21"/>
+            <w:tabs>
+              <w:tab w:val="right" w:leader="dot" w:pos="9745"/>
+            </w:tabs>
+            <w:rPr>
+              <w:rFonts w:asciiTheme="minorHAnsi" w:eastAsiaTheme="minorEastAsia" w:hAnsiTheme="minorHAnsi" w:cstheme="minorBidi"/>
+              <w:noProof/>
+              <w:sz w:val="22"/>
+              <w:szCs w:val="22"/>
+              <w:lang w:val="uk-UA" w:eastAsia="uk-UA"/>
+            </w:rPr>
+          </w:pPr>
+          <w:hyperlink w:anchor="_Toc228266827" w:history="1">
+            <w:r>
+              <w:rPr>
+                <w:rStyle w:val="a8"/>
+                <w:noProof/>
+                <w:lang w:val="uk-UA"/>
+              </w:rPr>
+              <w:t>Висновки до другого розділу</w:t>
+            </w:r>
+            <w:r>
+              <w:rPr>
+                <w:noProof/>
+                <w:webHidden/>
+              </w:rPr>
+              <w:tab/>
+            </w:r>
+            <w:r>
+              <w:rPr>
+                <w:noProof/>
+                <w:webHidden/>
+              </w:rPr>
+              <w:fldChar w:fldCharType="begin"/>
+            </w:r>
+            <w:r>
+              <w:rPr>
+                <w:noProof/>
+                <w:webHidden/>
+              </w:rPr>
+              <w:instrText xml:space="preserve"> PAGEREF _Toc228266827 \h </w:instrText>
             </w:r>
             <w:r>
               <w:rPr>
@@ -4603,7 +4146,7 @@
           <w:color w:val="000000"/>
           <w:sz w:val="28"/>
           <w:szCs w:val="22"/>
-          <w:lang w:val="en-US" w:eastAsia="en-US"/>
+          <w:lang w:val="uk-UA" w:eastAsia="en-US"/>
         </w:rPr>
       </w:pPr>
       <w:r>
@@ -4618,15 +4161,12 @@
         <w:jc w:val="both"/>
         <w:rPr>
           <w:sz w:val="28"/>
-          <w:lang w:val="en-US"/>
-        </w:rPr>
-      </w:pPr>
-      <w:bookmarkStart w:id="0" w:name="_Toc224673623"/>
+        </w:rPr>
+      </w:pPr>
       <w:r>
         <w:lastRenderedPageBreak/>
         <w:t>ВСТУП</w:t>
       </w:r>
-      <w:bookmarkEnd w:id="0"/>
       <w:r>
         <w:br/>
       </w:r>
@@ -4652,7 +4192,7 @@
         </w:rPr>
         <w:br w:type="page"/>
       </w:r>
-      <w:bookmarkStart w:id="1" w:name="_Toc224673624"/>
+      <w:bookmarkStart w:id="0" w:name="_Toc228266816"/>
       <w:r>
         <w:rPr>
           <w:lang w:val="ru-RU"/>
@@ -4672,7 +4212,7 @@
         </w:rPr>
         <w:t>АНАЛІЗ ПРОБЛЕМАТИКИ, МЕТОДІВ ТА ЗАСОБІВ ВИРІШЕННЯ ЗАДАЧІ</w:t>
       </w:r>
-      <w:bookmarkEnd w:id="1"/>
+      <w:bookmarkEnd w:id="0"/>
     </w:p>
     <w:p>
       <w:pPr>
@@ -4681,6 +4221,7 @@
           <w:lang w:val="ru-RU"/>
         </w:rPr>
       </w:pPr>
+      <w:bookmarkStart w:id="1" w:name="_Toc228266817"/>
       <w:r>
         <w:rPr>
           <w:lang w:val="uk-UA"/>
@@ -4742,6 +4283,7 @@
         </w:rPr>
         <w:t>вирішення</w:t>
       </w:r>
+      <w:bookmarkEnd w:id="1"/>
       <w:proofErr w:type="spellEnd"/>
     </w:p>
     <w:p>
@@ -5469,7 +5011,39 @@
           <w:sz w:val="28"/>
           <w:lang w:val="uk-UA"/>
         </w:rPr>
-        <w:t> — ім’я та прізвище користувача; Email — унікальна адреса електронної пошти (пошук за якою відбувається без урахування регістру, mode: 'insensitive'); </w:t>
+        <w:t> — ім’я та прізвище користувача; Email — унікальна адреса електронної пошти (пошук за якою відбувається без урахування регістру, </w:t>
+      </w:r>
+      <w:proofErr w:type="spellStart"/>
+      <w:r>
+        <w:rPr>
+          <w:sz w:val="28"/>
+          <w:lang w:val="uk-UA"/>
+        </w:rPr>
+        <w:t>mode</w:t>
+      </w:r>
+      <w:proofErr w:type="spellEnd"/>
+      <w:r>
+        <w:rPr>
+          <w:sz w:val="28"/>
+          <w:lang w:val="uk-UA"/>
+        </w:rPr>
+        <w:t>: '</w:t>
+      </w:r>
+      <w:proofErr w:type="spellStart"/>
+      <w:r>
+        <w:rPr>
+          <w:sz w:val="28"/>
+          <w:lang w:val="uk-UA"/>
+        </w:rPr>
+        <w:t>insensitive</w:t>
+      </w:r>
+      <w:proofErr w:type="spellEnd"/>
+      <w:r>
+        <w:rPr>
+          <w:sz w:val="28"/>
+          <w:lang w:val="uk-UA"/>
+        </w:rPr>
+        <w:t>'); </w:t>
       </w:r>
       <w:proofErr w:type="spellStart"/>
       <w:r>
@@ -5565,7 +5139,23 @@
           <w:sz w:val="28"/>
           <w:lang w:val="uk-UA"/>
         </w:rPr>
-        <w:t>) або заблокованим (banned). Для аудиту зберігається ідентифікатор особи, яка створила запис (</w:t>
+        <w:t>) або заблокованим (</w:t>
+      </w:r>
+      <w:proofErr w:type="spellStart"/>
+      <w:r>
+        <w:rPr>
+          <w:sz w:val="28"/>
+          <w:lang w:val="uk-UA"/>
+        </w:rPr>
+        <w:t>banned</w:t>
+      </w:r>
+      <w:proofErr w:type="spellEnd"/>
+      <w:r>
+        <w:rPr>
+          <w:sz w:val="28"/>
+          <w:lang w:val="uk-UA"/>
+        </w:rPr>
+        <w:t>). Для аудиту зберігається ідентифікатор особи, яка створила запис (</w:t>
       </w:r>
       <w:proofErr w:type="spellStart"/>
       <w:r>
@@ -6051,6 +5641,7 @@
           <w:lang w:val="ru-RU"/>
         </w:rPr>
       </w:pPr>
+      <w:bookmarkStart w:id="2" w:name="_Toc228266818"/>
       <w:r>
         <w:rPr>
           <w:lang w:val="ru-RU"/>
@@ -6106,6 +5697,7 @@
         </w:rPr>
         <w:t>забезпечення</w:t>
       </w:r>
+      <w:bookmarkEnd w:id="2"/>
       <w:proofErr w:type="spellEnd"/>
     </w:p>
     <w:p>
@@ -7788,7 +7380,23 @@
           <w:sz w:val="28"/>
           <w:lang w:val="uk-UA"/>
         </w:rPr>
-        <w:t xml:space="preserve"> Nodes).</w:t>
+        <w:t xml:space="preserve"> </w:t>
+      </w:r>
+      <w:proofErr w:type="spellStart"/>
+      <w:r>
+        <w:rPr>
+          <w:sz w:val="28"/>
+          <w:lang w:val="uk-UA"/>
+        </w:rPr>
+        <w:t>Nodes</w:t>
+      </w:r>
+      <w:proofErr w:type="spellEnd"/>
+      <w:r>
+        <w:rPr>
+          <w:sz w:val="28"/>
+          <w:lang w:val="uk-UA"/>
+        </w:rPr>
+        <w:t>).</w:t>
       </w:r>
     </w:p>
     <w:p>
@@ -7945,6 +7553,7 @@
           <w:lang w:val="ru-RU"/>
         </w:rPr>
       </w:pPr>
+      <w:bookmarkStart w:id="3" w:name="_Toc228266819"/>
       <w:r>
         <w:rPr>
           <w:lang w:val="ru-RU"/>
@@ -8001,6 +7610,7 @@
         </w:rPr>
         <w:t>забезпечення</w:t>
       </w:r>
+      <w:bookmarkEnd w:id="3"/>
       <w:proofErr w:type="spellEnd"/>
     </w:p>
     <w:p>
@@ -8447,6 +8057,7 @@
           <w:lang w:val="ru-RU" w:eastAsia="ru-RU"/>
         </w:rPr>
       </w:pPr>
+      <w:bookmarkStart w:id="4" w:name="_Toc228266820"/>
       <w:r>
         <w:rPr>
           <w:lang w:val="ru-RU"/>
@@ -8544,6 +8155,7 @@
         </w:rPr>
         <w:t>забезпечення</w:t>
       </w:r>
+      <w:bookmarkEnd w:id="4"/>
       <w:proofErr w:type="spellEnd"/>
     </w:p>
     <w:p>
@@ -9811,6 +9423,7 @@
           <w:lang w:val="ru-RU"/>
         </w:rPr>
       </w:pPr>
+      <w:bookmarkStart w:id="5" w:name="_Toc228266821"/>
       <w:proofErr w:type="spellStart"/>
       <w:r>
         <w:rPr>
@@ -9846,6 +9459,7 @@
         </w:rPr>
         <w:t>розділу</w:t>
       </w:r>
+      <w:bookmarkEnd w:id="5"/>
       <w:proofErr w:type="spellEnd"/>
     </w:p>
     <w:p>
@@ -10086,7 +9700,23 @@
           <w:sz w:val="28"/>
           <w:lang w:val="uk-UA"/>
         </w:rPr>
-        <w:t xml:space="preserve"> було приділено питанням інформаційної безпеки. Механізми автентифікації та авторизації побудовані на базі JSON Web </w:t>
+        <w:t xml:space="preserve"> було приділено питанням інформаційної безпеки. Механізми автентифікації та авторизації побудовані на базі JSON </w:t>
+      </w:r>
+      <w:proofErr w:type="spellStart"/>
+      <w:r>
+        <w:rPr>
+          <w:sz w:val="28"/>
+          <w:lang w:val="uk-UA"/>
+        </w:rPr>
+        <w:t>Web</w:t>
+      </w:r>
+      <w:proofErr w:type="spellEnd"/>
+      <w:r>
+        <w:rPr>
+          <w:sz w:val="28"/>
+          <w:lang w:val="uk-UA"/>
+        </w:rPr>
+        <w:t xml:space="preserve"> </w:t>
       </w:r>
       <w:proofErr w:type="spellStart"/>
       <w:r>
@@ -10250,6 +9880,7 @@
           <w:lang w:val="uk-UA"/>
         </w:rPr>
       </w:pPr>
+      <w:bookmarkStart w:id="6" w:name="_Toc228266822"/>
       <w:r>
         <w:rPr>
           <w:lang w:val="uk-UA"/>
@@ -10278,6 +9909,7 @@
         </w:rPr>
         <w:t>ДОДАТКУ ДЛЯ ПРОГНОЗУВАННЯ ТРЕНДІВ ЗА ДОПОМГОЮ АНСАМБЛІВ НЕЙРОМЕРЕЖ</w:t>
       </w:r>
+      <w:bookmarkEnd w:id="6"/>
     </w:p>
     <w:p>
       <w:pPr>
@@ -10286,12 +9918,14 @@
           <w:lang w:val="uk-UA"/>
         </w:rPr>
       </w:pPr>
+      <w:bookmarkStart w:id="7" w:name="_Toc228266823"/>
       <w:r>
         <w:rPr>
           <w:lang w:val="uk-UA"/>
         </w:rPr>
         <w:t>2.1 Проектування бази даних</w:t>
       </w:r>
+      <w:bookmarkEnd w:id="7"/>
     </w:p>
     <w:p>
       <w:pPr>
@@ -11086,12 +10720,14 @@
           <w:lang w:val="uk-UA"/>
         </w:rPr>
       </w:pPr>
+      <w:bookmarkStart w:id="8" w:name="_Toc228266824"/>
       <w:r>
         <w:rPr>
           <w:lang w:val="uk-UA"/>
         </w:rPr>
         <w:t>2.2. Розробка архітектури додатку</w:t>
       </w:r>
+      <w:bookmarkEnd w:id="8"/>
     </w:p>
     <w:p>
       <w:pPr>
@@ -11660,6 +11296,7 @@
           <w:lang w:val="ru-RU"/>
         </w:rPr>
       </w:pPr>
+      <w:bookmarkStart w:id="9" w:name="_Toc228266825"/>
       <w:r>
         <w:rPr>
           <w:lang w:val="ru-RU"/>
@@ -11729,6 +11366,7 @@
         </w:rPr>
         <w:t>програми</w:t>
       </w:r>
+      <w:bookmarkEnd w:id="9"/>
       <w:proofErr w:type="spellEnd"/>
     </w:p>
     <w:p>
@@ -11811,7 +11449,39 @@
           <w:sz w:val="28"/>
           <w:lang w:val="uk-UA"/>
         </w:rPr>
-        <w:t xml:space="preserve"> (Dependency Injection). Такий підхід дозволяє чітко розділити логіку прийому HTTP-запитів та безпосередню бізнес-логіку обробки даних, зменшуючи зв’язаність між компонентами системи та спрощуючи її масштабування і підтримку.</w:t>
+        <w:t xml:space="preserve"> (</w:t>
+      </w:r>
+      <w:proofErr w:type="spellStart"/>
+      <w:r>
+        <w:rPr>
+          <w:sz w:val="28"/>
+          <w:lang w:val="uk-UA"/>
+        </w:rPr>
+        <w:t>Dependency</w:t>
+      </w:r>
+      <w:proofErr w:type="spellEnd"/>
+      <w:r>
+        <w:rPr>
+          <w:sz w:val="28"/>
+          <w:lang w:val="uk-UA"/>
+        </w:rPr>
+        <w:t xml:space="preserve"> </w:t>
+      </w:r>
+      <w:proofErr w:type="spellStart"/>
+      <w:r>
+        <w:rPr>
+          <w:sz w:val="28"/>
+          <w:lang w:val="uk-UA"/>
+        </w:rPr>
+        <w:t>Injection</w:t>
+      </w:r>
+      <w:proofErr w:type="spellEnd"/>
+      <w:r>
+        <w:rPr>
+          <w:sz w:val="28"/>
+          <w:lang w:val="uk-UA"/>
+        </w:rPr>
+        <w:t>). Такий підхід дозволяє чітко розділити логіку прийому HTTP-запитів та безпосередню бізнес-логіку обробки даних, зменшуючи зв’язаність між компонентами системи та спрощуючи її масштабування і підтримку.</w:t>
       </w:r>
     </w:p>
     <w:p>
@@ -11961,7 +11631,23 @@
           <w:sz w:val="28"/>
           <w:lang w:val="uk-UA"/>
         </w:rPr>
-        <w:t xml:space="preserve"> одиниці роботи (Unit </w:t>
+        <w:t xml:space="preserve"> одиниці роботи (</w:t>
+      </w:r>
+      <w:proofErr w:type="spellStart"/>
+      <w:r>
+        <w:rPr>
+          <w:sz w:val="28"/>
+          <w:lang w:val="uk-UA"/>
+        </w:rPr>
+        <w:t>Unit</w:t>
+      </w:r>
+      <w:proofErr w:type="spellEnd"/>
+      <w:r>
+        <w:rPr>
+          <w:sz w:val="28"/>
+          <w:lang w:val="uk-UA"/>
+        </w:rPr>
+        <w:t xml:space="preserve"> </w:t>
       </w:r>
       <w:proofErr w:type="spellStart"/>
       <w:r>
@@ -12526,12 +12212,14 @@
           <w:lang w:val="uk-UA"/>
         </w:rPr>
       </w:pPr>
+      <w:bookmarkStart w:id="10" w:name="_Toc228266826"/>
       <w:r>
         <w:rPr>
           <w:lang w:val="uk-UA"/>
         </w:rPr>
         <w:t>2.4. Збереження файлів</w:t>
       </w:r>
+      <w:bookmarkEnd w:id="10"/>
     </w:p>
     <w:p>
       <w:pPr>
@@ -12604,7 +12292,39 @@
           <w:sz w:val="28"/>
           <w:lang w:val="uk-UA"/>
         </w:rPr>
-        <w:t xml:space="preserve"> Storage Service (S3). У контексті платформи для прогнозування ринкових трендів необхідність у файловому сховищі виникає під час завантаження користувачами власних наборів фінансових даних (</w:t>
+        <w:t xml:space="preserve"> </w:t>
+      </w:r>
+      <w:proofErr w:type="spellStart"/>
+      <w:r>
+        <w:rPr>
+          <w:sz w:val="28"/>
+          <w:lang w:val="uk-UA"/>
+        </w:rPr>
+        <w:t>Storage</w:t>
+      </w:r>
+      <w:proofErr w:type="spellEnd"/>
+      <w:r>
+        <w:rPr>
+          <w:sz w:val="28"/>
+          <w:lang w:val="uk-UA"/>
+        </w:rPr>
+        <w:t xml:space="preserve"> </w:t>
+      </w:r>
+      <w:proofErr w:type="spellStart"/>
+      <w:r>
+        <w:rPr>
+          <w:sz w:val="28"/>
+          <w:lang w:val="uk-UA"/>
+        </w:rPr>
+        <w:t>Service</w:t>
+      </w:r>
+      <w:proofErr w:type="spellEnd"/>
+      <w:r>
+        <w:rPr>
+          <w:sz w:val="28"/>
+          <w:lang w:val="uk-UA"/>
+        </w:rPr>
+        <w:t xml:space="preserve"> (S3). У контексті платформи для прогнозування ринкових трендів необхідність у файловому сховищі виникає під час завантаження користувачами власних наборів фінансових даних (</w:t>
       </w:r>
       <w:proofErr w:type="spellStart"/>
       <w:r>
@@ -13356,7 +13076,23 @@
           <w:sz w:val="28"/>
           <w:lang w:val="uk-UA"/>
         </w:rPr>
-        <w:t xml:space="preserve"> через конструктор (Dependency Injection). Це дозволяє централізовано керувати логікою збереження та легко підміняти реалізацію на етапі написання </w:t>
+        <w:t xml:space="preserve"> через конструктор (</w:t>
+      </w:r>
+      <w:proofErr w:type="spellStart"/>
+      <w:r>
+        <w:rPr>
+          <w:sz w:val="28"/>
+          <w:lang w:val="uk-UA"/>
+        </w:rPr>
+        <w:t>Dependency</w:t>
+      </w:r>
+      <w:proofErr w:type="spellEnd"/>
+      <w:r>
+        <w:rPr>
+          <w:sz w:val="28"/>
+          <w:lang w:val="uk-UA"/>
+        </w:rPr>
+        <w:t xml:space="preserve"> Injection). Це дозволяє централізовано керувати логікою збереження та легко підміняти реалізацію на етапі написання </w:t>
       </w:r>
       <w:proofErr w:type="spellStart"/>
       <w:r>
@@ -13450,7 +13186,23 @@
           <w:sz w:val="28"/>
           <w:lang w:val="uk-UA"/>
         </w:rPr>
-        <w:t xml:space="preserve"> Rules). Наприклад, файли тимчасових </w:t>
+        <w:t xml:space="preserve"> </w:t>
+      </w:r>
+      <w:proofErr w:type="spellStart"/>
+      <w:r>
+        <w:rPr>
+          <w:sz w:val="28"/>
+          <w:lang w:val="uk-UA"/>
+        </w:rPr>
+        <w:t>Rules</w:t>
+      </w:r>
+      <w:proofErr w:type="spellEnd"/>
+      <w:r>
+        <w:rPr>
+          <w:sz w:val="28"/>
+          <w:lang w:val="uk-UA"/>
+        </w:rPr>
+        <w:t xml:space="preserve">). Наприклад, файли тимчасових </w:t>
       </w:r>
       <w:proofErr w:type="spellStart"/>
       <w:r>
@@ -13524,12 +13276,14 @@
           <w:lang w:val="uk-UA"/>
         </w:rPr>
       </w:pPr>
+      <w:bookmarkStart w:id="11" w:name="_Toc228266827"/>
       <w:r>
         <w:rPr>
           <w:lang w:val="uk-UA"/>
         </w:rPr>
         <w:t>Висновки до другого розділу</w:t>
       </w:r>
+      <w:bookmarkEnd w:id="11"/>
     </w:p>
     <w:p>
       <w:pPr>
@@ -13861,7 +13615,87 @@
           <w:sz w:val="28"/>
           <w:lang w:val="uk-UA"/>
         </w:rPr>
-        <w:t xml:space="preserve"> Simple Storage Service (S3). Для інтеграції з цим сервісом було розроблено абстрагований провайдер, який приховує логіку взаємодії з хмарним сховищем. Попереднє налаштування облікового запису IAM (Identity and Access </w:t>
+        <w:t xml:space="preserve"> </w:t>
+      </w:r>
+      <w:proofErr w:type="spellStart"/>
+      <w:r>
+        <w:rPr>
+          <w:sz w:val="28"/>
+          <w:lang w:val="uk-UA"/>
+        </w:rPr>
+        <w:t>Simple</w:t>
+      </w:r>
+      <w:proofErr w:type="spellEnd"/>
+      <w:r>
+        <w:rPr>
+          <w:sz w:val="28"/>
+          <w:lang w:val="uk-UA"/>
+        </w:rPr>
+        <w:t xml:space="preserve"> </w:t>
+      </w:r>
+      <w:proofErr w:type="spellStart"/>
+      <w:r>
+        <w:rPr>
+          <w:sz w:val="28"/>
+          <w:lang w:val="uk-UA"/>
+        </w:rPr>
+        <w:t>Storage</w:t>
+      </w:r>
+      <w:proofErr w:type="spellEnd"/>
+      <w:r>
+        <w:rPr>
+          <w:sz w:val="28"/>
+          <w:lang w:val="uk-UA"/>
+        </w:rPr>
+        <w:t xml:space="preserve"> </w:t>
+      </w:r>
+      <w:proofErr w:type="spellStart"/>
+      <w:r>
+        <w:rPr>
+          <w:sz w:val="28"/>
+          <w:lang w:val="uk-UA"/>
+        </w:rPr>
+        <w:t>Service</w:t>
+      </w:r>
+      <w:proofErr w:type="spellEnd"/>
+      <w:r>
+        <w:rPr>
+          <w:sz w:val="28"/>
+          <w:lang w:val="uk-UA"/>
+        </w:rPr>
+        <w:t xml:space="preserve"> (S3). Для інтеграції з цим сервісом було розроблено абстрагований провайдер, який приховує логіку взаємодії з хмарним сховищем. Попереднє налаштування облікового запису IAM (</w:t>
+      </w:r>
+      <w:proofErr w:type="spellStart"/>
+      <w:r>
+        <w:rPr>
+          <w:sz w:val="28"/>
+          <w:lang w:val="uk-UA"/>
+        </w:rPr>
+        <w:t>Identity</w:t>
+      </w:r>
+      <w:proofErr w:type="spellEnd"/>
+      <w:r>
+        <w:rPr>
+          <w:sz w:val="28"/>
+          <w:lang w:val="uk-UA"/>
+        </w:rPr>
+        <w:t xml:space="preserve"> </w:t>
+      </w:r>
+      <w:proofErr w:type="spellStart"/>
+      <w:r>
+        <w:rPr>
+          <w:sz w:val="28"/>
+          <w:lang w:val="uk-UA"/>
+        </w:rPr>
+        <w:t>and</w:t>
+      </w:r>
+      <w:proofErr w:type="spellEnd"/>
+      <w:r>
+        <w:rPr>
+          <w:sz w:val="28"/>
+          <w:lang w:val="uk-UA"/>
+        </w:rPr>
+        <w:t xml:space="preserve"> Access </w:t>
       </w:r>
       <w:proofErr w:type="spellStart"/>
       <w:r>

</xml_diff>